<commit_message>
super admin testing complete
</commit_message>
<xml_diff>
--- a/Super_Admin_Dashboard_Testing_Readiness_Report.docx
+++ b/Super_Admin_Dashboard_Testing_Readiness_Report.docx
@@ -1554,13 +1554,13 @@
         <w:tblLook w:val="04A0" w:firstRow="1" w:lastRow="0" w:firstColumn="1" w:lastColumn="0" w:noHBand="0" w:noVBand="1"/>
       </w:tblPr>
       <w:tblGrid>
-        <w:gridCol w:w="377"/>
-        <w:gridCol w:w="1247"/>
+        <w:gridCol w:w="376"/>
+        <w:gridCol w:w="1246"/>
         <w:gridCol w:w="1116"/>
         <w:gridCol w:w="1857"/>
-        <w:gridCol w:w="2954"/>
+        <w:gridCol w:w="2950"/>
         <w:gridCol w:w="762"/>
-        <w:gridCol w:w="703"/>
+        <w:gridCol w:w="709"/>
       </w:tblGrid>
       <w:tr>
         <w:trPr>
@@ -2878,13 +2878,21 @@
             <w:tcW w:w="0" w:type="auto"/>
           </w:tcPr>
           <w:p>
-            <w:r>
-              <w:rPr>
-                <w:color w:val="000000"/>
-                <w:sz w:val="20"/>
-                <w:szCs w:val="20"/>
-              </w:rPr>
-              <w:t>NOT TESTED</w:t>
+            <w:pPr>
+              <w:rPr>
+                <w:b/>
+                <w:bCs/>
+              </w:rPr>
+            </w:pPr>
+            <w:r>
+              <w:rPr>
+                <w:b/>
+                <w:bCs/>
+                <w:color w:val="000000"/>
+                <w:sz w:val="20"/>
+                <w:szCs w:val="20"/>
+              </w:rPr>
+              <w:t>TESTED</w:t>
             </w:r>
           </w:p>
         </w:tc>
@@ -7780,13 +7788,21 @@
             <w:tcW w:w="0" w:type="auto"/>
           </w:tcPr>
           <w:p>
-            <w:r>
-              <w:rPr>
-                <w:color w:val="000000"/>
-                <w:sz w:val="20"/>
-                <w:szCs w:val="20"/>
-              </w:rPr>
-              <w:t>NOT TESTED</w:t>
+            <w:pPr>
+              <w:rPr>
+                <w:b/>
+                <w:bCs/>
+              </w:rPr>
+            </w:pPr>
+            <w:r>
+              <w:rPr>
+                <w:b/>
+                <w:bCs/>
+                <w:color w:val="000000"/>
+                <w:sz w:val="20"/>
+                <w:szCs w:val="20"/>
+              </w:rPr>
+              <w:t>TESTED</w:t>
             </w:r>
           </w:p>
         </w:tc>
@@ -8441,13 +8457,21 @@
             <w:tcW w:w="0" w:type="auto"/>
           </w:tcPr>
           <w:p>
-            <w:r>
-              <w:rPr>
-                <w:color w:val="000000"/>
-                <w:sz w:val="20"/>
-                <w:szCs w:val="20"/>
-              </w:rPr>
-              <w:t>NOT TESTED</w:t>
+            <w:pPr>
+              <w:rPr>
+                <w:b/>
+                <w:bCs/>
+              </w:rPr>
+            </w:pPr>
+            <w:r>
+              <w:rPr>
+                <w:b/>
+                <w:bCs/>
+                <w:color w:val="000000"/>
+                <w:sz w:val="20"/>
+                <w:szCs w:val="20"/>
+              </w:rPr>
+              <w:t>TESTED</w:t>
             </w:r>
           </w:p>
         </w:tc>
@@ -8905,13 +8929,21 @@
             <w:tcW w:w="0" w:type="auto"/>
           </w:tcPr>
           <w:p>
-            <w:r>
-              <w:rPr>
-                <w:color w:val="000000"/>
-                <w:sz w:val="20"/>
-                <w:szCs w:val="20"/>
-              </w:rPr>
-              <w:t>NOT TESTED</w:t>
+            <w:pPr>
+              <w:rPr>
+                <w:b/>
+                <w:bCs/>
+              </w:rPr>
+            </w:pPr>
+            <w:r>
+              <w:rPr>
+                <w:b/>
+                <w:bCs/>
+                <w:color w:val="000000"/>
+                <w:sz w:val="20"/>
+                <w:szCs w:val="20"/>
+              </w:rPr>
+              <w:t>TESTED</w:t>
             </w:r>
           </w:p>
         </w:tc>
@@ -10584,13 +10616,21 @@
             <w:tcW w:w="0" w:type="auto"/>
           </w:tcPr>
           <w:p>
-            <w:r>
-              <w:rPr>
-                <w:color w:val="000000"/>
-                <w:sz w:val="20"/>
-                <w:szCs w:val="20"/>
-              </w:rPr>
-              <w:t>NOT TESTED</w:t>
+            <w:pPr>
+              <w:rPr>
+                <w:b/>
+                <w:bCs/>
+              </w:rPr>
+            </w:pPr>
+            <w:r>
+              <w:rPr>
+                <w:b/>
+                <w:bCs/>
+                <w:color w:val="000000"/>
+                <w:sz w:val="20"/>
+                <w:szCs w:val="20"/>
+              </w:rPr>
+              <w:t>TESTED</w:t>
             </w:r>
           </w:p>
         </w:tc>
@@ -11622,13 +11662,21 @@
             <w:tcW w:w="0" w:type="auto"/>
           </w:tcPr>
           <w:p>
-            <w:r>
-              <w:rPr>
-                <w:color w:val="000000"/>
-                <w:sz w:val="20"/>
-                <w:szCs w:val="20"/>
-              </w:rPr>
-              <w:t>NOT TESTED</w:t>
+            <w:pPr>
+              <w:rPr>
+                <w:b/>
+                <w:bCs/>
+              </w:rPr>
+            </w:pPr>
+            <w:r>
+              <w:rPr>
+                <w:b/>
+                <w:bCs/>
+                <w:color w:val="000000"/>
+                <w:sz w:val="20"/>
+                <w:szCs w:val="20"/>
+              </w:rPr>
+              <w:t>TESTED</w:t>
             </w:r>
           </w:p>
         </w:tc>

</xml_diff>